<commit_message>
docs: expand LINE notification section with alert timing detail
Co-Authored-By: Claude Sonnet 4.6 <noreply@anthropic.com>
</commit_message>
<xml_diff>
--- a/docs/week-01-02-report.docx
+++ b/docs/week-01-02-report.docx
@@ -190,7 +190,65 @@
         <w:ind w:left="360"/>
       </w:pPr>
       <w:r>
-        <w:t>**LINE Notification** — เมื่อค่า sensor เกิน threshold HA automation ส่ง LINE message ผ่าน LINE Messaging API โดยมี debounce 2 นาทีกันข้อความ spam</w:t>
+        <w:t>**LINE Notification** — เมื่อค่า sensor เกิน threshold จะมีการแจ้งเตือนผ่าน LINE ตามเงื่อนไขดังนี้</w:t>
+      </w:r>
+    </w:p>
+    <w:p>
+      <w:r>
+        <w:t xml:space="preserve">   - ESP ส่งค่า sensor ขึ้น Home Assistant ทุก 2 วินาที</w:t>
+      </w:r>
+    </w:p>
+    <w:p>
+      <w:r>
+        <w:t xml:space="preserve">   - HA ตรวจสอบว่าค่าเกิน threshold หรือไม่ (เช่น PM2.5 &gt; 35.4 µg/m³ หรือ Temp &gt; 35°C)</w:t>
+      </w:r>
+    </w:p>
+    <w:p>
+      <w:r>
+        <w:t xml:space="preserve">   - </w:t>
+      </w:r>
+      <w:r>
+        <w:rPr>
+          <w:b/>
+        </w:rPr>
+        <w:t>ถ้าค่าเกินต่อเนื่องครบ 2 นาที</w:t>
+      </w:r>
+      <w:r>
+        <w:t xml:space="preserve"> → HA ส่ง LINE message 1 ครั้ง ผ่าน LINE Messaging API (</w:t>
+      </w:r>
+      <w:r>
+        <w:rPr>
+          <w:rFonts w:ascii="Courier New" w:hAnsi="Courier New"/>
+          <w:sz w:val="20"/>
+        </w:rPr>
+        <w:t>api.line.me/v2/bot/message/push</w:t>
+      </w:r>
+      <w:r>
+        <w:t>)</w:t>
+      </w:r>
+    </w:p>
+    <w:p>
+      <w:r>
+        <w:t xml:space="preserve">   - ถ้าค่ากลับมาปกติก่อนครบ 2 นาที → ยกเลิก ไม่ส่ง LINE</w:t>
+      </w:r>
+    </w:p>
+    <w:p>
+      <w:r>
+        <w:t xml:space="preserve">   - หลังส่งแล้ว ถ้าค่ายังเกินต่อเนื่อง → </w:t>
+      </w:r>
+      <w:r>
+        <w:rPr>
+          <w:b/>
+        </w:rPr>
+        <w:t>ไม่ส่งซ้ำ</w:t>
+      </w:r>
+      <w:r>
+        <w:t xml:space="preserve"> จนกว่าค่าจะกลับมาปกติก่อน แล้วเกินใหม่อีกครั้ง + รออีก 2 นาที ถึงจะส่งครั้งต่อไป</w:t>
+      </w:r>
+    </w:p>
+    <w:p>
+      <w:r>
+        <w:t xml:space="preserve">   - วิธีนี้ป้องกันข้อความ spam กรณีค่า sensor กระเพื่อมขึ้นลงรอบ threshold ตลอดเวลา</w:t>
       </w:r>
     </w:p>
     <w:p/>

</xml_diff>

<commit_message>
docs: expand ESP alert banner section with threshold and behavior detail
Co-Authored-By: Claude Sonnet 4.6 <noreply@anthropic.com>
</commit_message>
<xml_diff>
--- a/docs/week-01-02-report.docx
+++ b/docs/week-01-02-report.docx
@@ -180,7 +180,99 @@
         <w:ind w:left="360"/>
       </w:pPr>
       <w:r>
-        <w:t>**ระบบ Alert บนหน้าจอ** — ใช้ `lv_layer_top()` สร้าง banner overlay ที่แสดงทับทุกหน้าเมื่อค่าเกิน threshold (Temp &gt;35°C, Hum &lt;30%, PM2.5 &gt;35.4, PM10 &gt;254) แสดงสีตามความรุนแรง เหลือง/ส้ม/แดง</w:t>
+        <w:t>**ระบบ Alert บนหน้าจอ ESP** — ใช้ `lv_layer_top()` สร้าง banner overlay ที่แสดงทับทุกหน้าจอโดยไม่หายเมื่อสลับหน้า โดยมีเงื่อนไขดังนี้</w:t>
+      </w:r>
+    </w:p>
+    <w:p>
+      <w:r>
+        <w:t xml:space="preserve">   - ESP อ่านค่า sensor ทุก 2 วินาที และตรวจสอบทันทีว่าเกิน threshold หรือไม่</w:t>
+      </w:r>
+    </w:p>
+    <w:p>
+      <w:r>
+        <w:t xml:space="preserve">   - </w:t>
+      </w:r>
+      <w:r>
+        <w:rPr>
+          <w:b/>
+        </w:rPr>
+        <w:t>ถ้าค่าเกิน</w:t>
+      </w:r>
+      <w:r>
+        <w:t xml:space="preserve"> → banner แสดงขึ้นทันที ไม่มีการรอ พร้อมข้อความบอกว่าค่าใดเกินและเกินเท่าไหร่ เช่น </w:t>
+      </w:r>
+      <w:r>
+        <w:rPr>
+          <w:rFonts w:ascii="Courier New" w:hAnsi="Courier New"/>
+          <w:sz w:val="20"/>
+        </w:rPr>
+        <w:t>! PM2.5 42.3 MODERATE</w:t>
+      </w:r>
+      <w:r>
+        <w:t xml:space="preserve"> หรือ </w:t>
+      </w:r>
+      <w:r>
+        <w:rPr>
+          <w:rFonts w:ascii="Courier New" w:hAnsi="Courier New"/>
+          <w:sz w:val="20"/>
+        </w:rPr>
+        <w:t>! TEMP 36.1C &gt; 35</w:t>
+      </w:r>
+      <w:r/>
+    </w:p>
+    <w:p>
+      <w:r>
+        <w:t xml:space="preserve">   - </w:t>
+      </w:r>
+      <w:r>
+        <w:rPr>
+          <w:b/>
+        </w:rPr>
+        <w:t>ถ้ามีหลายค่าเกินพร้อมกัน</w:t>
+      </w:r>
+      <w:r>
+        <w:t xml:space="preserve"> → ข้อความจะต่อกันในบรรทัดเดียวและ scroll วิ่งไปเรื่อยๆ เช่น </w:t>
+      </w:r>
+      <w:r>
+        <w:rPr>
+          <w:rFonts w:ascii="Courier New" w:hAnsi="Courier New"/>
+          <w:sz w:val="20"/>
+        </w:rPr>
+        <w:t>! TEMP 36.1C &gt; 35     ! PM2.5 42.3 MODERATE</w:t>
+      </w:r>
+      <w:r/>
+    </w:p>
+    <w:p>
+      <w:r>
+        <w:t xml:space="preserve">   - </w:t>
+      </w:r>
+      <w:r>
+        <w:rPr>
+          <w:b/>
+        </w:rPr>
+        <w:t>สีของ banner บอกความรุนแรง</w:t>
+      </w:r>
+      <w:r>
+        <w:t xml:space="preserve"> — เหลือง (Humidity ต่ำ), ส้ม (Temp สูง หรือ PM2.5 Moderate), แดง (PM2.5 Unhealthy &gt;150.4 หรือ PM10 &gt;254)</w:t>
+      </w:r>
+    </w:p>
+    <w:p>
+      <w:r>
+        <w:t xml:space="preserve">   - </w:t>
+      </w:r>
+      <w:r>
+        <w:rPr>
+          <w:b/>
+        </w:rPr>
+        <w:t>ถ้าค่ากลับมาปกติ</w:t>
+      </w:r>
+      <w:r>
+        <w:t xml:space="preserve"> → banner หายทันทีในรอบการอ่านถัดไป (ภายใน 2 วินาที)</w:t>
+      </w:r>
+    </w:p>
+    <w:p>
+      <w:r>
+        <w:t xml:space="preserve">   - threshold ที่ใช้: Temp &gt;35°C, Humidity &lt;30%, PM2.5 &gt;35.4 µg/m³ (Moderate) / &gt;150.4 µg/m³ (Unhealthy), PM10 &gt;254 µg/m³</w:t>
       </w:r>
     </w:p>
     <w:p/>

</xml_diff>

<commit_message>
docs: expand RS485 Modbus RTU section with raw bytes, CRC and decode detail
Co-Authored-By: Claude Sonnet 4.6 <noreply@anthropic.com>
</commit_message>
<xml_diff>
--- a/docs/week-01-02-report.docx
+++ b/docs/week-01-02-report.docx
@@ -150,7 +150,176 @@
         <w:ind w:left="360"/>
       </w:pPr>
       <w:r>
-        <w:t>**อ่านค่า sensor จาก SN-300BYH-M** — ต่อผ่าน RS485 Modbus RTU (GPIO47 TX / GPIO48 RX, baud 9600) อ่านค่า Temperature, Humidity, PM2.5, PM10, Sound Level ทุก 2 วินาที และแสดงผลบนหน้าจอแบบ real-time</w:t>
+        <w:t>**อ่านค่า sensor จาก SN-300BYH-M ผ่าน RS485 Modbus RTU** — กระบวนการรับค่าและแปลงเป็นตัวเลขมีขั้นตอนดังนี้</w:t>
+      </w:r>
+    </w:p>
+    <w:p>
+      <w:r>
+        <w:t xml:space="preserve">   - </w:t>
+      </w:r>
+      <w:r>
+        <w:rPr>
+          <w:b/>
+        </w:rPr>
+        <w:t>การเชื่อมต่อ:</w:t>
+      </w:r>
+      <w:r>
+        <w:t xml:space="preserve"> ESP32-P4 ต่อกับ sensor ผ่านสาย RS485 (A+/B-) โดยใช้ GPIO47 (TX) และ GPIO48 (RX) กำหนด baud rate 9600, 8N1, Half-Duplex</w:t>
+      </w:r>
+    </w:p>
+    <w:p>
+      <w:r>
+        <w:t xml:space="preserve">   - </w:t>
+      </w:r>
+      <w:r>
+        <w:rPr>
+          <w:b/>
+        </w:rPr>
+        <w:t>การส่งคำสั่ง (Request):</w:t>
+      </w:r>
+      <w:r>
+        <w:t xml:space="preserve"> ESP ส่ง Modbus RTU request ทุก 2 วินาที ขนาด 8 bytes เพื่อขอให้ sensor ส่งค่ากลับมา เช่น </w:t>
+      </w:r>
+      <w:r>
+        <w:rPr>
+          <w:rFonts w:ascii="Courier New" w:hAnsi="Courier New"/>
+          <w:sz w:val="20"/>
+        </w:rPr>
+        <w:t>01 03 00 00 00 06 C5 C8</w:t>
+      </w:r>
+      <w:r>
+        <w:t xml:space="preserve"> หมายความว่า: Slave ID=01, Function=03 (Read Holding Registers), เริ่มที่ address 0x0000, อ่าน 6 registers, ตามด้วย CRC16 2 bytes</w:t>
+      </w:r>
+    </w:p>
+    <w:p>
+      <w:r>
+        <w:t xml:space="preserve">   - </w:t>
+      </w:r>
+      <w:r>
+        <w:rPr>
+          <w:b/>
+        </w:rPr>
+        <w:t>ข้อมูลที่วิ่งมาบนสาย (Raw Bytes):</w:t>
+      </w:r>
+      <w:r>
+        <w:t xml:space="preserve"> sensor ตอบกลับมาเป็น byte stream เช่น </w:t>
+      </w:r>
+      <w:r>
+        <w:rPr>
+          <w:rFonts w:ascii="Courier New" w:hAnsi="Courier New"/>
+          <w:sz w:val="20"/>
+        </w:rPr>
+        <w:t>01 03 0C 01 0C 00 F8 00 00 00 00 01 26 00 00 XX XX</w:t>
+      </w:r>
+      <w:r>
+        <w:t xml:space="preserve"> ซึ่งเป็น binary ดิบยังอ่านไม่รู้เรื่อง</w:t>
+      </w:r>
+    </w:p>
+    <w:p>
+      <w:r>
+        <w:t xml:space="preserve">   - </w:t>
+      </w:r>
+      <w:r>
+        <w:rPr>
+          <w:b/>
+        </w:rPr>
+        <w:t>การ verify ด้วย CRC16:</w:t>
+      </w:r>
+      <w:r>
+        <w:t xml:space="preserve"> ESP ตรวจสอบ 2 bytes สุดท้ายที่เป็น CRC16 checksum ก่อน ถ้าไม่ตรงหมายความว่าข้อมูลเสียหายระหว่างส่ง ทิ้งค่านั้นไปและรอรอบถัดไป</w:t>
+      </w:r>
+    </w:p>
+    <w:p>
+      <w:r>
+        <w:t xml:space="preserve">   - </w:t>
+      </w:r>
+      <w:r>
+        <w:rPr>
+          <w:b/>
+        </w:rPr>
+        <w:t>การ decode register เป็นตัวเลข:</w:t>
+      </w:r>
+      <w:r>
+        <w:t xml:space="preserve"> หลังผ่าน CRC แล้ว แต่ละ 2 bytes รวมกันเป็น 1 register (16-bit integer) แล้วนำไปแปลงตาม register map ของ SN-300BYH-M</w:t>
+      </w:r>
+    </w:p>
+    <w:p>
+      <w:r>
+        <w:t xml:space="preserve">     - Register 0x0000 → Humidity: หารด้วย 10 → </w:t>
+      </w:r>
+      <w:r>
+        <w:rPr>
+          <w:rFonts w:ascii="Courier New" w:hAnsi="Courier New"/>
+          <w:sz w:val="20"/>
+        </w:rPr>
+        <w:t>0x00F8 = 248 ÷ 10 = 24.8%</w:t>
+      </w:r>
+      <w:r/>
+    </w:p>
+    <w:p>
+      <w:r>
+        <w:t xml:space="preserve">     - Register 0x0001 → Temperature: หารด้วย 10 → </w:t>
+      </w:r>
+      <w:r>
+        <w:rPr>
+          <w:rFonts w:ascii="Courier New" w:hAnsi="Courier New"/>
+          <w:sz w:val="20"/>
+        </w:rPr>
+        <w:t>0x010C = 268 ÷ 10 = 26.8°C</w:t>
+      </w:r>
+      <w:r/>
+    </w:p>
+    <w:p>
+      <w:r>
+        <w:t xml:space="preserve">     - Register 0x0003 → PM10: หารด้วย 10 → </w:t>
+      </w:r>
+      <w:r>
+        <w:rPr>
+          <w:rFonts w:ascii="Courier New" w:hAnsi="Courier New"/>
+          <w:sz w:val="20"/>
+        </w:rPr>
+        <w:t>µg/m³</w:t>
+      </w:r>
+      <w:r/>
+    </w:p>
+    <w:p>
+      <w:r>
+        <w:t xml:space="preserve">     - Register 0x0004 → PM2.5: หารด้วย 10 → </w:t>
+      </w:r>
+      <w:r>
+        <w:rPr>
+          <w:rFonts w:ascii="Courier New" w:hAnsi="Courier New"/>
+          <w:sz w:val="20"/>
+        </w:rPr>
+        <w:t>µg/m³</w:t>
+      </w:r>
+      <w:r/>
+    </w:p>
+    <w:p>
+      <w:r>
+        <w:t xml:space="preserve">     - Register 0x0005 → Sound: ค่าดิบไม่ต้องหาร → </w:t>
+      </w:r>
+      <w:r>
+        <w:rPr>
+          <w:rFonts w:ascii="Courier New" w:hAnsi="Courier New"/>
+          <w:sz w:val="20"/>
+        </w:rPr>
+        <w:t>dB</w:t>
+      </w:r>
+      <w:r/>
+    </w:p>
+    <w:p>
+      <w:r>
+        <w:t xml:space="preserve">   - </w:t>
+      </w:r>
+      <w:r>
+        <w:rPr>
+          <w:b/>
+        </w:rPr>
+        <w:t>แสดงผลบนหน้าจอ:</w:t>
+      </w:r>
+      <w:r>
+        <w:t xml:space="preserve"> ค่าที่ได้จะ update label บน LVGL display ทุก 2 วินาที</w:t>
       </w:r>
     </w:p>
     <w:p/>

</xml_diff>

<commit_message>
docs: rewrite problems section with real issues encountered during development
Co-Authored-By: Claude Sonnet 4.6 <noreply@anthropic.com>
</commit_message>
<xml_diff>
--- a/docs/week-01-02-report.docx
+++ b/docs/week-01-02-report.docx
@@ -561,16 +561,67 @@
         <w:ind w:left="360"/>
       </w:pPr>
       <w:r>
-        <w:t>ESP32-P4 GPIO ไม่ตรงกับ datasheet ทั่วไป — BOOT button อยู่ GPIO35, Relay อยู่ GPIO32/46, RS485 อยู่ GPIO47/48 ทำให้ตอนแรก peripheral ไม่ทำงาน</w:t>
+        <w:t>**GPIO ไม่ตรงกับ datasheet ทั่วไป** — BOOT button, Relay, และ RS485 อยู่คนละ GPIO กับที่ระบุใน ESP32 datasheet ทั่วไป ทำให้ตอนแรก peripheral ไม่ทำงานเลย</w:t>
       </w:r>
     </w:p>
+    <w:p/>
     <w:p>
       <w:pPr>
         <w:pStyle w:val="ListNumber"/>
         <w:ind w:left="360"/>
       </w:pPr>
       <w:r>
-        <w:t>LINE Notify API ถูกปิดให้บริการไปแล้ว (มีนาคม 2568) ทำให้ต้องเปลี่ยนวิธีส่ง notification</w:t>
+        <w:t>**Build error: LVGL 9 API เปลี่ยนจาก v8** — เรียกใช้ `lv_qrcode_set_src()` แล้ว compiler ฟ้อง `not declared` เพราะ LVGL 9 เปลี่ยน API ใหม่หมด ต้องค้นหา function ที่ถูกต้องใหม่ทุกครั้ง</w:t>
+      </w:r>
+    </w:p>
+    <w:p/>
+    <w:p>
+      <w:pPr>
+        <w:pStyle w:val="ListNumber"/>
+        <w:ind w:left="360"/>
+      </w:pPr>
+      <w:r>
+        <w:t>**Task Watchdog (WDT) crash ตอน Setup Mode** — หลังเพิ่มระบบ Alert เสร็จ พอเข้า Setup Mode ESP บูตแล้วค้าง ขึ้น log `Task watchdog got triggered` และ reboot วนไม่หยุด สาเหตุคือ `ui_alert_check()` ถูกเรียกจาก sensor task แม้ตอน Setup Mode แต่ `ui_alert_init()` ยังไม่ถูกเรียก ทำให้ `s_banner = NULL` แล้วโค้ดพยายาม access NULL pointer ข้างใน display lock ทำให้ LVGL hang และ IDLE task ถูก starve จน WDT ดัง</w:t>
+      </w:r>
+    </w:p>
+    <w:p/>
+    <w:p>
+      <w:pPr>
+        <w:pStyle w:val="ListNumber"/>
+        <w:ind w:left="360"/>
+      </w:pPr>
+      <w:r>
+        <w:t>**อัป logo รูปแล้ว ESP crash ตอน restart** — หลัง upload รูปเสร็จ ESP เรียก `esp_restart()` ทันที แต่ปรากฏว่า Ethernet DMA ยังทำงานอยู่ระหว่าง reset ทำให้ DMA เขียนทับ bootloader code ใน SRAM และขึ้น `Illegal instruction` crash บูตไม่ขึ้น ต้องกด flash ใหม่ทุกครั้งที่อัปรูป</w:t>
+      </w:r>
+    </w:p>
+    <w:p/>
+    <w:p>
+      <w:pPr>
+        <w:pStyle w:val="ListNumber"/>
+        <w:ind w:left="360"/>
+      </w:pPr>
+      <w:r>
+        <w:t>**PM History กราฟ 7 วันทำไม่ได้บน ESP อย่างเดียว** — ตอนแรกออกแบบให้ ESP เก็บค่าเฉลี่ยรายวันไว้ใน RAM เอง แต่ติดปัญหาคือข้อมูลหายทุกครั้งที่ reboot และ ESP ไม่มี RTC จริงๆ ทำให้ไม่รู้ว่าแต่ละวันคือวันไหน ข้อมูลจึงไม่ถูกต้อง</w:t>
+      </w:r>
+    </w:p>
+    <w:p/>
+    <w:p>
+      <w:pPr>
+        <w:pStyle w:val="ListNumber"/>
+        <w:ind w:left="360"/>
+      </w:pPr>
+      <w:r>
+        <w:t>**Relay state ไม่ sync กับ HA** — ตอนแรก HA ส่ง command มาควบคุม relay ได้ แต่ถ้ากด relay จากหน้าจอ ESP โดยตรง HA ไม่รู้ว่า state เปลี่ยน dashboard ยังแสดงค่าเก่าอยู่ และถ้ากดจาก HA อีกครั้ง state จะสลับผิดทิศทาง</w:t>
+      </w:r>
+    </w:p>
+    <w:p/>
+    <w:p>
+      <w:pPr>
+        <w:pStyle w:val="ListNumber"/>
+        <w:ind w:left="360"/>
+      </w:pPr>
+      <w:r>
+        <w:t>**DNS ล้มเหลวตอนต่อ MQTT ครั้งแรก** — หลังได้ IP จาก Ethernet แล้วพยายาม connect MQTT broker ด้วย hostname แต่ `getaddrinfo()` ฟ้อง `EAI_AGAIN` ทุกครั้ง เพราะ ARP cache ยังไม่มี entry ของ gateway ทำให้ DNS query แรกไม่ได้รับ reply ก่อน timeout</w:t>
       </w:r>
     </w:p>
     <w:p/>
@@ -592,16 +643,67 @@
         <w:ind w:left="360"/>
       </w:pPr>
       <w:r>
-        <w:t>ดู schematic ของ Waveshare ESP32-P4-86-Panel โดยตรง และทดสอบ GPIO ทีละตัว จนพบค่าที่ถูกต้องสำหรับบอร์ดนี้</w:t>
+        <w:t>ดู schematic ของ Waveshare ESP32-P4-86-Panel โดยตรงและทดสอบ GPIO ทีละตัว พบว่า BOOT=GPIO35, Relay=GPIO32/46, RS485=GPIO47(TX)/48(RX)</w:t>
       </w:r>
     </w:p>
+    <w:p/>
     <w:p>
       <w:pPr>
         <w:pStyle w:val="ListNumber"/>
         <w:ind w:left="360"/>
       </w:pPr>
       <w:r>
-        <w:t>เปลี่ยนมาใช้ LINE Messaging API แทน โดยสร้าง LINE Official Account และใช้ `rest_command` ใน HA ส่ง HTTP POST ไปที่ `api.line.me/v2/bot/message/push`</w:t>
+        <w:t>ค้นหาใน LVGL 9 source code และ changelog พบว่าต้องใช้ `lv_qrcode_update(obj, data, len)` แทน `lv_qrcode_set_src()` และ API หลายตัวมีการเปลี่ยนชื่อใหม่ทั้งหมด</w:t>
+      </w:r>
+    </w:p>
+    <w:p/>
+    <w:p>
+      <w:pPr>
+        <w:pStyle w:val="ListNumber"/>
+        <w:ind w:left="360"/>
+      </w:pPr>
+      <w:r>
+        <w:t>เพิ่ม NULL check `if (!s_banner) return;` ไว้ต้นฟังก์ชัน `ui_alert_check()` เพื่อให้ return ออกทันทีถ้า `ui_alert_init()` ยังไม่ถูกเรียก ทำให้ Setup Mode ทำงานได้ปกติ</w:t>
+      </w:r>
+    </w:p>
+    <w:p/>
+    <w:p>
+      <w:pPr>
+        <w:pStyle w:val="ListNumber"/>
+        <w:ind w:left="360"/>
+      </w:pPr>
+      <w:r>
+        <w:t>แก้โดยเรียก `esp_eth_stop()` ก่อนแล้วรอ 200ms ให้ DMA หยุดทำงานก่อนค่อยเรียก `esp_restart()` ทำให้ ESP restart สะอาดโดยไม่ crash</w:t>
+      </w:r>
+    </w:p>
+    <w:p/>
+    <w:p>
+      <w:pPr>
+        <w:pStyle w:val="ListNumber"/>
+        <w:ind w:left="360"/>
+      </w:pPr>
+      <w:r>
+        <w:t>ย้ายการเก็บ history ไปไว้บน Home Assistant (Raspberry Pi) แทน โดย HA บันทึกค่าเฉลี่ยรายชั่วโมงลง database ตัวเอง แล้วส่งกลับมาให้ ESP ผ่าน MQTT เมื่อ ESP connect HA จะส่ง retained message ที่เก็บไว้มาให้ทันที ทำให้ได้ข้อมูลย้อนหลังที่ถูกต้องแม้ ESP reboot</w:t>
+      </w:r>
+    </w:p>
+    <w:p/>
+    <w:p>
+      <w:pPr>
+        <w:pStyle w:val="ListNumber"/>
+        <w:ind w:left="360"/>
+      </w:pPr>
+      <w:r>
+        <w:t>แก้โดยให้ ESP publish relay state กลับไปที่ MQTT topic `liv24/relay/N/state` ทุกครั้งที่มีการเปลี่ยน state ไม่ว่าจะมาจากหน้าจอหรือจาก HA ทำให้ HA รับรู้ state จริงตลอดเวลา</w:t>
+      </w:r>
+    </w:p>
+    <w:p/>
+    <w:p>
+      <w:pPr>
+        <w:pStyle w:val="ListNumber"/>
+        <w:ind w:left="360"/>
+      </w:pPr>
+      <w:r>
+        <w:t>แก้โดยเพิ่ม TCP probe ไปที่ gateway ก่อนเริ่ม MQTT client เพื่อ warm up ARP cache ให้ lwIP มี entry ของ gateway พร้อมก่อนที่ DNS query จะส่งออก</w:t>
       </w:r>
     </w:p>
     <w:p/>

</xml_diff>

<commit_message>
docs: rewrite all problems in plain language for non-technical readers
Co-Authored-By: Claude Sonnet 4.6 <noreply@anthropic.com>
</commit_message>
<xml_diff>
--- a/docs/week-01-02-report.docx
+++ b/docs/week-01-02-report.docx
@@ -561,7 +561,7 @@
         <w:ind w:left="360"/>
       </w:pPr>
       <w:r>
-        <w:t>**GPIO ไม่ตรงกับ datasheet ทั่วไป** — BOOT button, Relay, และ RS485 อยู่คนละ GPIO กับที่ระบุใน ESP32 datasheet ทั่วไป ทำให้ตอนแรก peripheral ไม่ทำงานเลย</w:t>
+        <w:t>**ขาต่ออุปกรณ์ไม่ตรงกับเอกสาร** — บอร์ดรุ่นนี้เป็นบอร์ด custom ของ Waveshare ทำให้ขาที่ใช้ต่อปุ่ม relay และ RS485 ไม่ตรงกับเอกสาร ESP32 ทั่วไปที่หาได้บน internet ต่อตามที่อ่านมาแล้วอุปกรณ์ไม่ตอบสนองเลย</w:t>
       </w:r>
     </w:p>
     <w:p/>
@@ -571,7 +571,7 @@
         <w:ind w:left="360"/>
       </w:pPr>
       <w:r>
-        <w:t>**Build error: LVGL 9 API เปลี่ยนจาก v8** — เรียกใช้ `lv_qrcode_set_src()` แล้ว compiler ฟ้อง `not declared` เพราะ LVGL 9 เปลี่ยน API ใหม่หมด ต้องค้นหา function ที่ถูกต้องใหม่ทุกครั้ง</w:t>
+        <w:t>**ตัวอย่างโค้ดบน GitHub เป็น version เก่า** — ทำตาม example ที่หามาได้แต่โปรแกรม build ไม่ผ่าน เพราะ library ที่ใช้ (LVGL) อัปเดต version ใหม่และเปลี่ยนชื่อ function ไปหมด ต้องไปหา document ของ version ใหม่และเขียนใหม่</w:t>
       </w:r>
     </w:p>
     <w:p/>
@@ -581,7 +581,7 @@
         <w:ind w:left="360"/>
       </w:pPr>
       <w:r>
-        <w:t>**Task Watchdog (WDT) crash ตอน Setup Mode** — หลังเพิ่มระบบ Alert เสร็จ พอเข้า Setup Mode ESP บูตแล้วค้าง ขึ้น log `Task watchdog got triggered` และ reboot วนไม่หยุด สาเหตุคือ `ui_alert_check()` ถูกเรียกจาก sensor task แม้ตอน Setup Mode แต่ `ui_alert_init()` ยังไม่ถูกเรียก ทำให้ `s_banner = NULL` แล้วโค้ดพยายาม access NULL pointer ข้างใน display lock ทำให้ LVGL hang และ IDLE task ถูก starve จน WDT ดัง</w:t>
+        <w:t>**บอร์ด reboot วนซ้ำไม่หยุดหลังเพิ่มระบบ alert** — หลังเพิ่มระบบแจ้งเตือนเสร็จ พอเข้าหน้า Setup Mode บอร์ดค้างแล้ว reboot ตัวเองวนซ้ำไม่หยุด สาเหตุคือโค้ดระบบ alert ถูกเรียกในหน้า Setup Mode ทั้งที่ยังไม่ได้สร้าง alert banner ขึ้นมา ทำให้โปรแกรมพยายามแก้ไข object ที่ไม่มีอยู่จริงและค้าง</w:t>
       </w:r>
     </w:p>
     <w:p/>
@@ -591,7 +591,7 @@
         <w:ind w:left="360"/>
       </w:pPr>
       <w:r>
-        <w:t>**อัป logo รูปแล้ว ESP crash ตอน restart** — หลัง upload รูปเสร็จ ESP เรียก `esp_restart()` ทันที แต่ปรากฏว่า Ethernet DMA ยังทำงานอยู่ระหว่าง reset ทำให้ DMA เขียนทับ bootloader code ใน SRAM และขึ้น `Illegal instruction` crash บูตไม่ขึ้น ต้องกด flash ใหม่ทุกครั้งที่อัปรูป</w:t>
+        <w:t>**บอร์ดบูตไม่ขึ้นหลังอัปรูป logo** — หลังอัปโหลดรูปเสร็จ บอร์ดจะ restart ตัวเองอัตโนมัติ แต่ปรากฏว่า restart กลางคันทำให้ข้อมูลบางส่วนเขียนทับหน่วยความจำผิดตำแหน่ง บอร์ดบูตไม่ขึ้นและต้อง flash โปรแกรมใหม่ทุกครั้งที่อัปรูป</w:t>
       </w:r>
     </w:p>
     <w:p/>
@@ -601,7 +601,7 @@
         <w:ind w:left="360"/>
       </w:pPr>
       <w:r>
-        <w:t>**PM History กราฟ 7 วันทำไม่ได้บน ESP อย่างเดียว** — ตอนแรกออกแบบให้ ESP เก็บค่าเฉลี่ยรายวันไว้ใน RAM เอง แต่ติดปัญหาคือข้อมูลหายทุกครั้งที่ reboot และ ESP ไม่มี RTC จริงๆ ทำให้ไม่รู้ว่าแต่ละวันคือวันไหน ข้อมูลจึงไม่ถูกต้อง</w:t>
+        <w:t>**กราฟ PM ย้อนหลัง 7 วันเก็บไว้ใน ESP ไม่ได้** — ออกแบบให้บอร์ด ESP เก็บข้อมูลย้อนหลัง 7 วันเอง แต่ทำไม่ได้เพราะข้อมูลหายทุกครั้งที่บอร์ด reboot และบอร์ดไม่รู้เวลาจริง ทำให้ไม่รู้ว่าข้อมูลแต่ละชุดเป็นของวันไหน</w:t>
       </w:r>
     </w:p>
     <w:p/>
@@ -611,7 +611,7 @@
         <w:ind w:left="360"/>
       </w:pPr>
       <w:r>
-        <w:t>**Relay state ไม่ sync กับ HA** — ตอนแรก HA ส่ง command มาควบคุม relay ได้ แต่ถ้ากด relay จากหน้าจอ ESP โดยตรง HA ไม่รู้ว่า state เปลี่ยน dashboard ยังแสดงค่าเก่าอยู่ และถ้ากดจาก HA อีกครั้ง state จะสลับผิดทิศทาง</w:t>
+        <w:t>**สถานะ Relay บน HA ไม่อัปเดตเมื่อกดจากหน้าจอ ESP** — กด relay จากหน้าจอ ESP ได้ปกติ แต่ dashboard บน Home Assistant ยังแสดงสถานะเดิม พอกดจาก HA ซ้ำอีกครั้ง relay กลับสลับทิศทางผิด เพราะ HA ไม่รู้ว่าสถานะจริงเป็นอะไร</w:t>
       </w:r>
     </w:p>
     <w:p/>
@@ -621,7 +621,7 @@
         <w:ind w:left="360"/>
       </w:pPr>
       <w:r>
-        <w:t>**DNS ล้มเหลวตอนต่อ MQTT ครั้งแรก** — หลังได้ IP จาก Ethernet แล้วพยายาม connect MQTT broker ด้วย hostname แต่ `getaddrinfo()` ฟ้อง `EAI_AGAIN` ทุกครั้ง เพราะ ARP cache ยังไม่มี entry ของ gateway ทำให้ DNS query แรกไม่ได้รับ reply ก่อน timeout</w:t>
+        <w:t>**ต่อ MQTT ไม่ได้ทั้งที่ค่า config ถูกหมด** — หลังบอร์ดได้ IP จาก Ethernet แล้ว พยายาม connect กับ MQTT broker แต่ connect ไม่ได้ทุกครั้ง ทั้งที่ IP และ port ถูกหมด ต้อง reboot หลายรอบถึงจะต่อได้</w:t>
       </w:r>
     </w:p>
     <w:p/>
@@ -643,7 +643,7 @@
         <w:ind w:left="360"/>
       </w:pPr>
       <w:r>
-        <w:t>ดู schematic ของ Waveshare ESP32-P4-86-Panel โดยตรงและทดสอบ GPIO ทีละตัว พบว่า BOOT=GPIO35, Relay=GPIO32/46, RS485=GPIO47(TX)/48(RX)</w:t>
+        <w:t>ดู schematic ของ Waveshare ESP32-P4-86-Panel โดยตรงและทดสอบ GPIO ทีละตัวจนพบขาที่ถูกต้องสำหรับบอร์ดนี้</w:t>
       </w:r>
     </w:p>
     <w:p/>
@@ -653,7 +653,7 @@
         <w:ind w:left="360"/>
       </w:pPr>
       <w:r>
-        <w:t>ค้นหาใน LVGL 9 source code และ changelog พบว่าต้องใช้ `lv_qrcode_update(obj, data, len)` แทน `lv_qrcode_set_src()` และ API หลายตัวมีการเปลี่ยนชื่อใหม่ทั้งหมด</w:t>
+        <w:t>เข้าไปอ่าน document และ changelog ของ LVGL version ใหม่โดยตรง แล้วเปลี่ยนมาใช้ชื่อ function ที่ถูกต้องตาม version ที่ใช้งานจริง</w:t>
       </w:r>
     </w:p>
     <w:p/>
@@ -663,7 +663,7 @@
         <w:ind w:left="360"/>
       </w:pPr>
       <w:r>
-        <w:t>เพิ่ม NULL check `if (!s_banner) return;` ไว้ต้นฟังก์ชัน `ui_alert_check()` เพื่อให้ return ออกทันทีถ้า `ui_alert_init()` ยังไม่ถูกเรียก ทำให้ Setup Mode ทำงานได้ปกติ</w:t>
+        <w:t>เพิ่มการตรวจสอบก่อนว่า alert banner ถูกสร้างขึ้นแล้วหรือยัง ถ้ายังให้ข้ามไปก่อน ทำให้หน้า Setup Mode ทำงานได้ปกติโดยไม่กระทบระบบ alert</w:t>
       </w:r>
     </w:p>
     <w:p/>
@@ -673,7 +673,7 @@
         <w:ind w:left="360"/>
       </w:pPr>
       <w:r>
-        <w:t>แก้โดยเรียก `esp_eth_stop()` ก่อนแล้วรอ 200ms ให้ DMA หยุดทำงานก่อนค่อยเรียก `esp_restart()` ทำให้ ESP restart สะอาดโดยไม่ crash</w:t>
+        <w:t>แก้โดยให้บอร์ดหยุด Ethernet ก่อน แล้วรอสักครู่ให้ทุกอย่างหยุดทำงานอย่างสมบูรณ์ก่อนค่อย restart ทำให้บูตขึ้นได้ปกติทุกครั้ง</w:t>
       </w:r>
     </w:p>
     <w:p/>
@@ -683,7 +683,7 @@
         <w:ind w:left="360"/>
       </w:pPr>
       <w:r>
-        <w:t>ย้ายการเก็บ history ไปไว้บน Home Assistant (Raspberry Pi) แทน โดย HA บันทึกค่าเฉลี่ยรายชั่วโมงลง database ตัวเอง แล้วส่งกลับมาให้ ESP ผ่าน MQTT เมื่อ ESP connect HA จะส่ง retained message ที่เก็บไว้มาให้ทันที ทำให้ได้ข้อมูลย้อนหลังที่ถูกต้องแม้ ESP reboot</w:t>
+        <w:t>ย้ายการเก็บ history ไปไว้บน Home Assistant (Raspberry Pi) แทน HA บันทึกค่าเฉลี่ยรายชั่วโมงไว้ใน database ของตัวเอง แล้วส่งกลับมาให้ ESP ผ่าน MQTT เมื่อ ESP เชื่อมต่อ ทำให้ได้ข้อมูลย้อนหลังที่ถูกต้องแม้บอร์ดจะ reboot</w:t>
       </w:r>
     </w:p>
     <w:p/>
@@ -693,7 +693,7 @@
         <w:ind w:left="360"/>
       </w:pPr>
       <w:r>
-        <w:t>แก้โดยให้ ESP publish relay state กลับไปที่ MQTT topic `liv24/relay/N/state` ทุกครั้งที่มีการเปลี่ยน state ไม่ว่าจะมาจากหน้าจอหรือจาก HA ทำให้ HA รับรู้ state จริงตลอดเวลา</w:t>
+        <w:t>แก้โดยให้ ESP ส่งสถานะ relay กลับไปแจ้ง HA ทุกครั้งที่มีการเปลี่ยนแปลง ไม่ว่าจะกดจากหน้าจอหรือจาก HA ทำให้ทั้งสองฝั่งรู้สถานะจริงตลอดเวลา</w:t>
       </w:r>
     </w:p>
     <w:p/>
@@ -703,7 +703,7 @@
         <w:ind w:left="360"/>
       </w:pPr>
       <w:r>
-        <w:t>แก้โดยเพิ่ม TCP probe ไปที่ gateway ก่อนเริ่ม MQTT client เพื่อ warm up ARP cache ให้ lwIP มี entry ของ gateway พร้อมก่อนที่ DNS query จะส่งออก</w:t>
+        <w:t>พบว่าสาเหตุคือบอร์ดยังไม่รู้จัก address ของ router ตัวเองในเครือข่าย ทำให้ส่ง request ไปไม่ถึง แก้โดยให้บอร์ด "ทักทาย" router ก่อน 1 ครั้ง เพื่อให้เครือข่ายรู้จักกันก่อนค่อยเชื่อมต่อ MQTT</w:t>
       </w:r>
     </w:p>
     <w:p/>

</xml_diff>